<commit_message>
Update audio availability wording and rebuild downloads
</commit_message>
<xml_diff>
--- a/public/downloads/exams/Final_Exam_Teacher_Packet.docx
+++ b/public/downloads/exams/Final_Exam_Teacher_Packet.docx
@@ -688,7 +688,7 @@
                 <w:i w:val="0"/>
                 <w:sz w:val="23"/>
               </w:rPr>
-              <w:t xml:space="preserve"> (script below; audio to be produced) + phone and small speaker</w:t>
+              <w:t xml:space="preserve"> (script below; audio on the website) + phone and small speaker</w:t>
             </w:r>
           </w:p>
           <w:p>
@@ -10863,7 +10863,7 @@
           <w:i w:val="0"/>
           <w:sz w:val="22"/>
         </w:rPr>
-        <w:t>Listening audio (when produced): synthetic voices made with Chatterbox TTS by Resemble AI (MIT License); each file carries an inaudible Perth watermark that marks it as AI-generated.</w:t>
+        <w:t>Listening audio (on the website, for every lesson and both exams): synthetic voices made with Chatterbox TTS by Resemble AI (MIT License); each file carries an inaudible Perth watermark that marks it as AI-generated.</w:t>
       </w:r>
     </w:p>
     <w:p>

</xml_diff>